<commit_message>
Actividad 6 Taller investigativo Métodos para seleccionar elementos del DOM
</commit_message>
<xml_diff>
--- a/Cuarto Trimestre/Actividad #6/Taller investigativo Métodos para seleccionar elementos del DOM .docx
+++ b/Cuarto Trimestre/Actividad #6/Taller investigativo Métodos para seleccionar elementos del DOM .docx
@@ -72,7 +72,6 @@
         </w:rPr>
         <w:tab/>
       </w:r>
-      <w:proofErr w:type="gramStart"/>
       <w:r>
         <w:rPr>
           <w:rFonts w:ascii="Arial" w:eastAsia="Arial" w:hAnsi="Arial" w:cs="Arial"/>
@@ -100,7 +99,6 @@
         </w:rPr>
         <w:t>a</w:t>
       </w:r>
-      <w:proofErr w:type="gramEnd"/>
       <w:r>
         <w:rPr>
           <w:rFonts w:ascii="Arial" w:eastAsia="Arial" w:hAnsi="Arial" w:cs="Arial"/>
@@ -5825,12 +5823,10 @@
       </w:pPr>
       <w:bookmarkStart w:id="1" w:name="_Toc238893465"/>
       <w:proofErr w:type="spellStart"/>
-      <w:proofErr w:type="gramStart"/>
       <w:r>
         <w:t>document.getElementsByClassName</w:t>
       </w:r>
       <w:proofErr w:type="spellEnd"/>
-      <w:proofErr w:type="gramEnd"/>
       <w:r>
         <w:t>()</w:t>
       </w:r>
@@ -6140,12 +6136,10 @@
       </w:pPr>
       <w:bookmarkStart w:id="12" w:name="_Toc238893476"/>
       <w:proofErr w:type="spellStart"/>
-      <w:proofErr w:type="gramStart"/>
       <w:r>
         <w:t>document.getElementsByTagName</w:t>
       </w:r>
       <w:proofErr w:type="spellEnd"/>
-      <w:proofErr w:type="gramEnd"/>
       <w:r>
         <w:t>()</w:t>
       </w:r>
@@ -6422,12 +6416,10 @@
       </w:pPr>
       <w:bookmarkStart w:id="23" w:name="_Toc238893487"/>
       <w:proofErr w:type="spellStart"/>
-      <w:proofErr w:type="gramStart"/>
       <w:r>
         <w:t>document.querySelector</w:t>
       </w:r>
       <w:proofErr w:type="spellEnd"/>
-      <w:proofErr w:type="gramEnd"/>
       <w:r>
         <w:t>()</w:t>
       </w:r>
@@ -6523,7 +6515,6 @@
       </w:r>
     </w:p>
     <w:p>
-      <w:proofErr w:type="gramStart"/>
       <w:r>
         <w:t xml:space="preserve">Devuelve </w:t>
       </w:r>
@@ -6535,7 +6526,6 @@
         <w:t>HTMLCollection</w:t>
       </w:r>
       <w:proofErr w:type="spellEnd"/>
-      <w:proofErr w:type="gramEnd"/>
     </w:p>
     <w:p>
       <w:pPr>
@@ -6680,13 +6670,8 @@
     </w:p>
     <w:p>
       <w:r>
-        <w:t xml:space="preserve">No permite utilizar selectores </w:t>
-      </w:r>
-      <w:proofErr w:type="gramStart"/>
-      <w:r>
-        <w:t>complejos</w:t>
-      </w:r>
-      <w:proofErr w:type="gramEnd"/>
+        <w:t>No permite utilizar selectores complejos</w:t>
+      </w:r>
       <w:r>
         <w:t xml:space="preserve"> </w:t>
       </w:r>
@@ -6712,12 +6697,10 @@
       </w:pPr>
       <w:bookmarkStart w:id="34" w:name="_Toc238893498"/>
       <w:proofErr w:type="spellStart"/>
-      <w:proofErr w:type="gramStart"/>
       <w:r>
         <w:t>document.querySelectorAll</w:t>
       </w:r>
       <w:proofErr w:type="spellEnd"/>
-      <w:proofErr w:type="gramEnd"/>
       <w:r>
         <w:t>()</w:t>
       </w:r>
@@ -6808,17 +6791,12 @@
     </w:p>
     <w:p>
       <w:proofErr w:type="spellStart"/>
-      <w:proofErr w:type="gramStart"/>
       <w:r>
         <w:t>querySelector</w:t>
       </w:r>
       <w:proofErr w:type="spellEnd"/>
       <w:r>
-        <w:t>(</w:t>
-      </w:r>
-      <w:proofErr w:type="gramEnd"/>
-      <w:r>
-        <w:t>) devuelve solamente el primer elemento que coincida.</w:t>
+        <w:t>() devuelve solamente el primer elemento que coincida.</w:t>
       </w:r>
     </w:p>
     <w:p>
@@ -6870,17 +6848,12 @@
     </w:p>
     <w:p>
       <w:proofErr w:type="spellStart"/>
-      <w:proofErr w:type="gramStart"/>
       <w:r>
         <w:t>querySelector</w:t>
       </w:r>
       <w:proofErr w:type="spellEnd"/>
       <w:r>
-        <w:t>(</w:t>
-      </w:r>
-      <w:proofErr w:type="gramEnd"/>
-      <w:r>
-        <w:t>) normalmente no se utiliza para recorrer varios elementos, porque solo devuelve uno.</w:t>
+        <w:t>() normalmente no se utiliza para recorrer varios elementos, porque solo devuelve uno.</w:t>
       </w:r>
       <w:r>
         <w:t> </w:t>
@@ -6991,30 +6964,20 @@
       </w:pPr>
       <w:bookmarkStart w:id="46" w:name="_Toc238893510"/>
       <w:proofErr w:type="spellStart"/>
-      <w:proofErr w:type="gramStart"/>
       <w:r>
         <w:t>getElementById</w:t>
       </w:r>
       <w:proofErr w:type="spellEnd"/>
       <w:r>
-        <w:t>(</w:t>
-      </w:r>
-      <w:proofErr w:type="gramEnd"/>
-      <w:r>
-        <w:t>) y </w:t>
+        <w:t>() y </w:t>
       </w:r>
       <w:proofErr w:type="spellStart"/>
-      <w:proofErr w:type="gramStart"/>
       <w:r>
         <w:t>getElementsByClassName</w:t>
       </w:r>
       <w:proofErr w:type="spellEnd"/>
       <w:r>
-        <w:t>(</w:t>
-      </w:r>
-      <w:proofErr w:type="gramEnd"/>
-      <w:r>
-        <w:t>)</w:t>
+        <w:t>()</w:t>
       </w:r>
       <w:bookmarkEnd w:id="46"/>
       <w:r>
@@ -7065,7 +7028,6 @@
               </w:rPr>
             </w:pPr>
             <w:proofErr w:type="spellStart"/>
-            <w:proofErr w:type="gramStart"/>
             <w:r>
               <w:rPr>
                 <w:b/>
@@ -7079,15 +7041,7 @@
                 <w:b/>
                 <w:bCs/>
               </w:rPr>
-              <w:t>(</w:t>
-            </w:r>
-            <w:proofErr w:type="gramEnd"/>
-            <w:r>
-              <w:rPr>
-                <w:b/>
-                <w:bCs/>
-              </w:rPr>
-              <w:t>)</w:t>
+              <w:t>()</w:t>
             </w:r>
           </w:p>
         </w:tc>
@@ -7105,7 +7059,6 @@
               </w:rPr>
             </w:pPr>
             <w:proofErr w:type="spellStart"/>
-            <w:proofErr w:type="gramStart"/>
             <w:r>
               <w:rPr>
                 <w:b/>
@@ -7119,15 +7072,7 @@
                 <w:b/>
                 <w:bCs/>
               </w:rPr>
-              <w:t>(</w:t>
-            </w:r>
-            <w:proofErr w:type="gramEnd"/>
-            <w:r>
-              <w:rPr>
-                <w:b/>
-                <w:bCs/>
-              </w:rPr>
-              <w:t>)</w:t>
+              <w:t>()</w:t>
             </w:r>
           </w:p>
         </w:tc>
@@ -7277,17 +7222,12 @@
         <w:t xml:space="preserve">Usaría </w:t>
       </w:r>
       <w:proofErr w:type="spellStart"/>
-      <w:proofErr w:type="gramStart"/>
       <w:r>
         <w:t>getElementById</w:t>
       </w:r>
       <w:proofErr w:type="spellEnd"/>
       <w:r>
-        <w:t>(</w:t>
-      </w:r>
-      <w:proofErr w:type="gramEnd"/>
-      <w:r>
-        <w:t>) cuando necesito trabajar con un elemento específico y único</w:t>
+        <w:t>() cuando necesito trabajar con un elemento específico y único</w:t>
       </w:r>
     </w:p>
     <w:p>
@@ -7302,17 +7242,12 @@
         <w:t xml:space="preserve">Usaría </w:t>
       </w:r>
       <w:proofErr w:type="spellStart"/>
-      <w:proofErr w:type="gramStart"/>
       <w:r>
         <w:t>getElementsByClassName</w:t>
       </w:r>
       <w:proofErr w:type="spellEnd"/>
       <w:r>
-        <w:t>(</w:t>
-      </w:r>
-      <w:proofErr w:type="gramEnd"/>
-      <w:r>
-        <w:t>) cuando quiero trabajar con varios elementos que comparten una clase</w:t>
+        <w:t>() cuando quiero trabajar con varios elementos que comparten una clase</w:t>
       </w:r>
     </w:p>
     <w:p>
@@ -7321,30 +7256,20 @@
       </w:pPr>
       <w:bookmarkStart w:id="47" w:name="_Toc238893511"/>
       <w:proofErr w:type="spellStart"/>
-      <w:proofErr w:type="gramStart"/>
       <w:r>
         <w:t>getElementsByClassName</w:t>
       </w:r>
       <w:proofErr w:type="spellEnd"/>
       <w:r>
-        <w:t>(</w:t>
-      </w:r>
-      <w:proofErr w:type="gramEnd"/>
-      <w:r>
-        <w:t>) y </w:t>
+        <w:t>() y </w:t>
       </w:r>
       <w:proofErr w:type="spellStart"/>
-      <w:proofErr w:type="gramStart"/>
       <w:r>
         <w:t>getElementsByTagName</w:t>
       </w:r>
       <w:proofErr w:type="spellEnd"/>
       <w:r>
-        <w:t>(</w:t>
-      </w:r>
-      <w:proofErr w:type="gramEnd"/>
-      <w:r>
-        <w:t>)</w:t>
+        <w:t>()</w:t>
       </w:r>
       <w:bookmarkEnd w:id="47"/>
       <w:r>
@@ -7394,7 +7319,6 @@
               </w:rPr>
             </w:pPr>
             <w:proofErr w:type="spellStart"/>
-            <w:proofErr w:type="gramStart"/>
             <w:r>
               <w:rPr>
                 <w:b/>
@@ -7408,15 +7332,7 @@
                 <w:b/>
                 <w:bCs/>
               </w:rPr>
-              <w:t>(</w:t>
-            </w:r>
-            <w:proofErr w:type="gramEnd"/>
-            <w:r>
-              <w:rPr>
-                <w:b/>
-                <w:bCs/>
-              </w:rPr>
-              <w:t>)</w:t>
+              <w:t>()</w:t>
             </w:r>
           </w:p>
         </w:tc>
@@ -7434,7 +7350,6 @@
               </w:rPr>
             </w:pPr>
             <w:proofErr w:type="spellStart"/>
-            <w:proofErr w:type="gramStart"/>
             <w:r>
               <w:rPr>
                 <w:b/>
@@ -7448,15 +7363,7 @@
                 <w:b/>
                 <w:bCs/>
               </w:rPr>
-              <w:t>(</w:t>
-            </w:r>
-            <w:proofErr w:type="gramEnd"/>
-            <w:r>
-              <w:rPr>
-                <w:b/>
-                <w:bCs/>
-              </w:rPr>
-              <w:t>)</w:t>
+              <w:t>()</w:t>
             </w:r>
           </w:p>
         </w:tc>
@@ -7611,17 +7518,12 @@
         <w:t xml:space="preserve"> </w:t>
       </w:r>
       <w:proofErr w:type="spellStart"/>
-      <w:proofErr w:type="gramStart"/>
       <w:r>
         <w:t>getElementsByClassName</w:t>
       </w:r>
       <w:proofErr w:type="spellEnd"/>
       <w:r>
-        <w:t>(</w:t>
-      </w:r>
-      <w:proofErr w:type="gramEnd"/>
-      <w:r>
-        <w:t>)</w:t>
+        <w:t>()</w:t>
       </w:r>
       <w:r>
         <w:t xml:space="preserve"> </w:t>
@@ -7636,30 +7538,20 @@
       </w:pPr>
       <w:bookmarkStart w:id="48" w:name="_Toc238893512"/>
       <w:proofErr w:type="spellStart"/>
-      <w:proofErr w:type="gramStart"/>
       <w:r>
         <w:t>querySelector</w:t>
       </w:r>
       <w:proofErr w:type="spellEnd"/>
       <w:r>
-        <w:t>(</w:t>
-      </w:r>
-      <w:proofErr w:type="gramEnd"/>
-      <w:r>
-        <w:t>) y </w:t>
+        <w:t>() y </w:t>
       </w:r>
       <w:proofErr w:type="spellStart"/>
-      <w:proofErr w:type="gramStart"/>
       <w:r>
         <w:t>querySelectorAll</w:t>
       </w:r>
       <w:proofErr w:type="spellEnd"/>
       <w:r>
-        <w:t>(</w:t>
-      </w:r>
-      <w:proofErr w:type="gramEnd"/>
-      <w:r>
-        <w:t>)</w:t>
+        <w:t>()</w:t>
       </w:r>
       <w:bookmarkEnd w:id="48"/>
       <w:r>
@@ -7710,7 +7602,6 @@
               </w:rPr>
             </w:pPr>
             <w:proofErr w:type="spellStart"/>
-            <w:proofErr w:type="gramStart"/>
             <w:r>
               <w:rPr>
                 <w:b/>
@@ -7724,15 +7615,7 @@
                 <w:b/>
                 <w:bCs/>
               </w:rPr>
-              <w:t>(</w:t>
-            </w:r>
-            <w:proofErr w:type="gramEnd"/>
-            <w:r>
-              <w:rPr>
-                <w:b/>
-                <w:bCs/>
-              </w:rPr>
-              <w:t>)</w:t>
+              <w:t>()</w:t>
             </w:r>
           </w:p>
         </w:tc>
@@ -7750,7 +7633,6 @@
               </w:rPr>
             </w:pPr>
             <w:proofErr w:type="spellStart"/>
-            <w:proofErr w:type="gramStart"/>
             <w:r>
               <w:rPr>
                 <w:b/>
@@ -7764,15 +7646,7 @@
                 <w:b/>
                 <w:bCs/>
               </w:rPr>
-              <w:t>(</w:t>
-            </w:r>
-            <w:proofErr w:type="gramEnd"/>
-            <w:r>
-              <w:rPr>
-                <w:b/>
-                <w:bCs/>
-              </w:rPr>
-              <w:t>)</w:t>
+              <w:t>()</w:t>
             </w:r>
           </w:p>
         </w:tc>
@@ -7920,17 +7794,12 @@
     </w:p>
     <w:p>
       <w:proofErr w:type="spellStart"/>
-      <w:proofErr w:type="gramStart"/>
       <w:r>
         <w:t>querySelector</w:t>
       </w:r>
       <w:proofErr w:type="spellEnd"/>
       <w:r>
-        <w:t>(</w:t>
-      </w:r>
-      <w:proofErr w:type="gramEnd"/>
-      <w:r>
-        <w:t>)</w:t>
+        <w:t>()</w:t>
       </w:r>
       <w:r>
         <w:t xml:space="preserve"> </w:t>
@@ -7945,30 +7814,20 @@
       </w:pPr>
       <w:bookmarkStart w:id="49" w:name="_Toc238893513"/>
       <w:proofErr w:type="spellStart"/>
-      <w:proofErr w:type="gramStart"/>
       <w:r>
         <w:t>getElementsByClassName</w:t>
       </w:r>
       <w:proofErr w:type="spellEnd"/>
       <w:r>
-        <w:t>(</w:t>
-      </w:r>
-      <w:proofErr w:type="gramEnd"/>
-      <w:r>
-        <w:t>) y </w:t>
+        <w:t>() y </w:t>
       </w:r>
       <w:proofErr w:type="spellStart"/>
-      <w:proofErr w:type="gramStart"/>
       <w:r>
         <w:t>querySelectorAll</w:t>
       </w:r>
       <w:proofErr w:type="spellEnd"/>
       <w:r>
-        <w:t>(</w:t>
-      </w:r>
-      <w:proofErr w:type="gramEnd"/>
-      <w:r>
-        <w:t>)</w:t>
+        <w:t>()</w:t>
       </w:r>
       <w:bookmarkEnd w:id="49"/>
       <w:r>
@@ -8019,7 +7878,6 @@
               </w:rPr>
             </w:pPr>
             <w:proofErr w:type="spellStart"/>
-            <w:proofErr w:type="gramStart"/>
             <w:r>
               <w:rPr>
                 <w:b/>
@@ -8033,15 +7891,7 @@
                 <w:b/>
                 <w:bCs/>
               </w:rPr>
-              <w:t>(</w:t>
-            </w:r>
-            <w:proofErr w:type="gramEnd"/>
-            <w:r>
-              <w:rPr>
-                <w:b/>
-                <w:bCs/>
-              </w:rPr>
-              <w:t>)</w:t>
+              <w:t>()</w:t>
             </w:r>
           </w:p>
         </w:tc>
@@ -8059,7 +7909,6 @@
               </w:rPr>
             </w:pPr>
             <w:proofErr w:type="spellStart"/>
-            <w:proofErr w:type="gramStart"/>
             <w:r>
               <w:rPr>
                 <w:b/>
@@ -8073,15 +7922,7 @@
                 <w:b/>
                 <w:bCs/>
               </w:rPr>
-              <w:t>(</w:t>
-            </w:r>
-            <w:proofErr w:type="gramEnd"/>
-            <w:r>
-              <w:rPr>
-                <w:b/>
-                <w:bCs/>
-              </w:rPr>
-              <w:t>)</w:t>
+              <w:t>()</w:t>
             </w:r>
           </w:p>
         </w:tc>
@@ -8246,18 +8087,13 @@
         </w:numPr>
       </w:pPr>
       <w:proofErr w:type="spellStart"/>
-      <w:proofErr w:type="gramStart"/>
       <w:r>
         <w:lastRenderedPageBreak/>
         <w:t>getElementsByClassName</w:t>
       </w:r>
       <w:proofErr w:type="spellEnd"/>
       <w:r>
-        <w:t>(</w:t>
-      </w:r>
-      <w:proofErr w:type="gramEnd"/>
-      <w:r>
-        <w:t>) devuelve una colección viva (</w:t>
+        <w:t>() devuelve una colección viva (</w:t>
       </w:r>
       <w:proofErr w:type="spellStart"/>
       <w:r>
@@ -8277,17 +8113,12 @@
         </w:numPr>
       </w:pPr>
       <w:proofErr w:type="spellStart"/>
-      <w:proofErr w:type="gramStart"/>
       <w:r>
         <w:t>querySelectorAll</w:t>
       </w:r>
       <w:proofErr w:type="spellEnd"/>
       <w:r>
-        <w:t>(</w:t>
-      </w:r>
-      <w:proofErr w:type="gramEnd"/>
-      <w:r>
-        <w:t xml:space="preserve">) devuelve una </w:t>
+        <w:t xml:space="preserve">() devuelve una </w:t>
       </w:r>
       <w:proofErr w:type="spellStart"/>
       <w:r>
@@ -8304,30 +8135,20 @@
       </w:pPr>
       <w:bookmarkStart w:id="50" w:name="_Toc238893514"/>
       <w:proofErr w:type="spellStart"/>
-      <w:proofErr w:type="gramStart"/>
       <w:r>
         <w:t>getElementById</w:t>
       </w:r>
       <w:proofErr w:type="spellEnd"/>
       <w:r>
-        <w:t>(</w:t>
-      </w:r>
-      <w:proofErr w:type="gramEnd"/>
-      <w:r>
-        <w:t>) y </w:t>
+        <w:t>() y </w:t>
       </w:r>
       <w:proofErr w:type="spellStart"/>
-      <w:proofErr w:type="gramStart"/>
       <w:r>
         <w:t>querySelector</w:t>
       </w:r>
       <w:proofErr w:type="spellEnd"/>
       <w:r>
-        <w:t>(</w:t>
-      </w:r>
-      <w:proofErr w:type="gramEnd"/>
-      <w:r>
-        <w:t>)</w:t>
+        <w:t>()</w:t>
       </w:r>
       <w:bookmarkEnd w:id="50"/>
       <w:r>
@@ -8377,7 +8198,6 @@
               </w:rPr>
             </w:pPr>
             <w:proofErr w:type="spellStart"/>
-            <w:proofErr w:type="gramStart"/>
             <w:r>
               <w:rPr>
                 <w:b/>
@@ -8391,15 +8211,7 @@
                 <w:b/>
                 <w:bCs/>
               </w:rPr>
-              <w:t>(</w:t>
-            </w:r>
-            <w:proofErr w:type="gramEnd"/>
-            <w:r>
-              <w:rPr>
-                <w:b/>
-                <w:bCs/>
-              </w:rPr>
-              <w:t>)</w:t>
+              <w:t>()</w:t>
             </w:r>
           </w:p>
         </w:tc>
@@ -8417,7 +8229,6 @@
               </w:rPr>
             </w:pPr>
             <w:proofErr w:type="spellStart"/>
-            <w:proofErr w:type="gramStart"/>
             <w:r>
               <w:rPr>
                 <w:b/>
@@ -8431,15 +8242,7 @@
                 <w:b/>
                 <w:bCs/>
               </w:rPr>
-              <w:t>(</w:t>
-            </w:r>
-            <w:proofErr w:type="gramEnd"/>
-            <w:r>
-              <w:rPr>
-                <w:b/>
-                <w:bCs/>
-              </w:rPr>
-              <w:t>)</w:t>
+              <w:t>()</w:t>
             </w:r>
           </w:p>
         </w:tc>
@@ -8614,10 +8417,7 @@
         </w:rPr>
       </w:pPr>
       <w:r>
-        <w:t xml:space="preserve">Los dos encuentran el mismo </w:t>
-      </w:r>
-      <w:r>
-        <w:t>elemento,</w:t>
+        <w:t>Los dos encuentran el mismo elemento,</w:t>
       </w:r>
       <w:r>
         <w:t xml:space="preserve"> </w:t>
@@ -8629,17 +8429,12 @@
         <w:t xml:space="preserve"> </w:t>
       </w:r>
       <w:proofErr w:type="spellStart"/>
-      <w:proofErr w:type="gramStart"/>
       <w:r>
         <w:t>getElementById</w:t>
       </w:r>
       <w:proofErr w:type="spellEnd"/>
       <w:r>
-        <w:t>(</w:t>
-      </w:r>
-      <w:proofErr w:type="gramEnd"/>
-      <w:r>
-        <w:t>)</w:t>
+        <w:t>()</w:t>
       </w:r>
     </w:p>
     <w:p>
@@ -8782,16 +8577,7 @@
           <w:sz w:val="28"/>
           <w:szCs w:val="28"/>
         </w:rPr>
-        <w:t xml:space="preserve">El selector por clase </w:t>
-      </w:r>
-      <w:proofErr w:type="gramStart"/>
-      <w:r>
-        <w:rPr>
-          <w:rFonts w:ascii="Arial" w:eastAsia="Arial" w:hAnsi="Arial" w:cs="Arial"/>
-          <w:sz w:val="28"/>
-          <w:szCs w:val="28"/>
-        </w:rPr>
-        <w:t>utiliza</w:t>
+        <w:t>El selector por clase utiliza</w:t>
       </w:r>
       <w:r>
         <w:rPr>
@@ -8801,7 +8587,6 @@
         </w:rPr>
         <w:t xml:space="preserve"> .</w:t>
       </w:r>
-      <w:proofErr w:type="gramEnd"/>
     </w:p>
     <w:p>
       <w:pPr>
@@ -8920,7 +8705,7 @@
           <w:szCs w:val="28"/>
         </w:rPr>
         <w:lastRenderedPageBreak/>
-        <w:t>Los selectores por atributo permiten seleccionar elementos utilizando sus atributos HTML.</w:t>
+        <w:t>Los selectores por atributo permiten seleccionar elementos utilizando sus atributos HTML. Se escriben entre</w:t>
       </w:r>
       <w:r>
         <w:rPr>
@@ -8928,34 +8713,8 @@
           <w:sz w:val="28"/>
           <w:szCs w:val="28"/>
         </w:rPr>
-        <w:t xml:space="preserve"> </w:t>
-      </w:r>
-      <w:r>
-        <w:rPr>
-          <w:rFonts w:ascii="Arial" w:hAnsi="Arial" w:cs="Arial"/>
-          <w:sz w:val="28"/>
-          <w:szCs w:val="28"/>
-        </w:rPr>
-        <w:t>Se escriben entre</w:t>
-      </w:r>
-      <w:r>
-        <w:rPr>
-          <w:rFonts w:ascii="Arial" w:hAnsi="Arial" w:cs="Arial"/>
-          <w:sz w:val="28"/>
-          <w:szCs w:val="28"/>
-        </w:rPr>
-        <w:t xml:space="preserve"> </w:t>
-      </w:r>
-      <w:proofErr w:type="gramStart"/>
-      <w:r>
-        <w:rPr>
-          <w:rFonts w:ascii="Arial" w:hAnsi="Arial" w:cs="Arial"/>
-          <w:sz w:val="28"/>
-          <w:szCs w:val="28"/>
-        </w:rPr>
-        <w:t>[ ]</w:t>
-      </w:r>
-      <w:proofErr w:type="gramEnd"/>
+        <w:t xml:space="preserve"> [ ]</w:t>
+      </w:r>
     </w:p>
     <w:p>
       <w:pPr>
@@ -8996,23 +8755,7 @@
           <w:sz w:val="28"/>
           <w:szCs w:val="28"/>
         </w:rPr>
-        <w:t>Este selector es especialmente importante</w:t>
-      </w:r>
-      <w:r>
-        <w:rPr>
-          <w:rFonts w:ascii="Arial" w:hAnsi="Arial" w:cs="Arial"/>
-          <w:sz w:val="28"/>
-          <w:szCs w:val="28"/>
-        </w:rPr>
-        <w:t xml:space="preserve"> </w:t>
-      </w:r>
-      <w:r>
-        <w:rPr>
-          <w:rFonts w:ascii="Arial" w:hAnsi="Arial" w:cs="Arial"/>
-          <w:sz w:val="28"/>
-          <w:szCs w:val="28"/>
-        </w:rPr>
-        <w:t xml:space="preserve">Se utiliza un </w:t>
+        <w:t xml:space="preserve">Este selector es especialmente importante Se utiliza un </w:t>
       </w:r>
       <w:r>
         <w:rPr>
@@ -9096,6 +8839,7 @@
       <w:r>
         <w:rPr>
           <w:rFonts w:ascii="Arial" w:eastAsia="Arial" w:hAnsi="Arial" w:cs="Arial"/>
+          <w:noProof/>
           <w:sz w:val="28"/>
           <w:szCs w:val="28"/>
         </w:rPr>
@@ -9166,6 +8910,7 @@
       <w:r>
         <w:rPr>
           <w:rFonts w:ascii="Arial" w:eastAsia="Arial" w:hAnsi="Arial" w:cs="Arial"/>
+          <w:noProof/>
           <w:sz w:val="28"/>
           <w:szCs w:val="28"/>
         </w:rPr>
@@ -9242,7 +8987,6 @@
         <w:t>¿Por qué </w:t>
       </w:r>
       <w:proofErr w:type="spellStart"/>
-      <w:proofErr w:type="gramStart"/>
       <w:r>
         <w:rPr>
           <w:rFonts w:ascii="Arial" w:eastAsia="Arial" w:hAnsi="Arial" w:cs="Arial"/>
@@ -9258,19 +9002,9 @@
           <w:sz w:val="28"/>
           <w:szCs w:val="28"/>
         </w:rPr>
-        <w:t>(</w:t>
-      </w:r>
-      <w:proofErr w:type="gramEnd"/>
-      <w:r>
-        <w:rPr>
-          <w:rFonts w:ascii="Arial" w:eastAsia="Arial" w:hAnsi="Arial" w:cs="Arial"/>
-          <w:sz w:val="28"/>
-          <w:szCs w:val="28"/>
-        </w:rPr>
-        <w:t>) y </w:t>
+        <w:t>() y </w:t>
       </w:r>
       <w:proofErr w:type="spellStart"/>
-      <w:proofErr w:type="gramStart"/>
       <w:r>
         <w:rPr>
           <w:rFonts w:ascii="Arial" w:eastAsia="Arial" w:hAnsi="Arial" w:cs="Arial"/>
@@ -9286,16 +9020,7 @@
           <w:sz w:val="28"/>
           <w:szCs w:val="28"/>
         </w:rPr>
-        <w:t>(</w:t>
-      </w:r>
-      <w:proofErr w:type="gramEnd"/>
-      <w:r>
-        <w:rPr>
-          <w:rFonts w:ascii="Arial" w:eastAsia="Arial" w:hAnsi="Arial" w:cs="Arial"/>
-          <w:sz w:val="28"/>
-          <w:szCs w:val="28"/>
-        </w:rPr>
-        <w:t>) permiten realizar selecciones más específicas? </w:t>
+        <w:t>() permiten realizar selecciones más específicas? </w:t>
       </w:r>
     </w:p>
     <w:p>
@@ -9316,7 +9041,6 @@
         <w:t> </w:t>
       </w:r>
       <w:proofErr w:type="spellStart"/>
-      <w:proofErr w:type="gramStart"/>
       <w:r>
         <w:rPr>
           <w:rFonts w:ascii="Arial" w:eastAsia="Arial" w:hAnsi="Arial" w:cs="Arial"/>
@@ -9332,19 +9056,9 @@
           <w:sz w:val="28"/>
           <w:szCs w:val="28"/>
         </w:rPr>
-        <w:t>(</w:t>
-      </w:r>
-      <w:proofErr w:type="gramEnd"/>
-      <w:r>
-        <w:rPr>
-          <w:rFonts w:ascii="Arial" w:eastAsia="Arial" w:hAnsi="Arial" w:cs="Arial"/>
-          <w:sz w:val="28"/>
-          <w:szCs w:val="28"/>
-        </w:rPr>
-        <w:t xml:space="preserve">) y </w:t>
+        <w:t xml:space="preserve">() y </w:t>
       </w:r>
       <w:proofErr w:type="spellStart"/>
-      <w:proofErr w:type="gramStart"/>
       <w:r>
         <w:rPr>
           <w:rFonts w:ascii="Arial" w:eastAsia="Arial" w:hAnsi="Arial" w:cs="Arial"/>
@@ -9360,16 +9074,7 @@
           <w:sz w:val="28"/>
           <w:szCs w:val="28"/>
         </w:rPr>
-        <w:t>(</w:t>
-      </w:r>
-      <w:proofErr w:type="gramEnd"/>
-      <w:r>
-        <w:rPr>
-          <w:rFonts w:ascii="Arial" w:eastAsia="Arial" w:hAnsi="Arial" w:cs="Arial"/>
-          <w:sz w:val="28"/>
-          <w:szCs w:val="28"/>
-        </w:rPr>
-        <w:t xml:space="preserve">) permiten selecciones más específicas porque utilizan la sintaxis de los selectores CSS, que permite combinar etiquetas, clases, </w:t>
+        <w:t xml:space="preserve">() permiten selecciones más específicas porque utilizan la sintaxis de los selectores CSS, que permite combinar etiquetas, clases, </w:t>
       </w:r>
       <w:proofErr w:type="spellStart"/>
       <w:r>
@@ -9601,6 +9306,7 @@
       <w:r>
         <w:rPr>
           <w:rFonts w:ascii="Arial" w:eastAsia="Arial" w:hAnsi="Arial" w:cs="Arial"/>
+          <w:noProof/>
           <w:sz w:val="28"/>
           <w:szCs w:val="28"/>
         </w:rPr>
@@ -9681,6 +9387,7 @@
       <w:r>
         <w:rPr>
           <w:rFonts w:ascii="Arial" w:eastAsia="Arial" w:hAnsi="Arial" w:cs="Arial"/>
+          <w:noProof/>
           <w:sz w:val="28"/>
           <w:szCs w:val="28"/>
         </w:rPr>
@@ -9733,6 +9440,7 @@
       <w:r>
         <w:rPr>
           <w:rFonts w:ascii="Arial" w:eastAsia="Arial" w:hAnsi="Arial" w:cs="Arial"/>
+          <w:noProof/>
           <w:sz w:val="28"/>
           <w:szCs w:val="28"/>
         </w:rPr>
@@ -9812,6 +9520,7 @@
       <w:r>
         <w:rPr>
           <w:rFonts w:ascii="Arial" w:eastAsia="Arial" w:hAnsi="Arial" w:cs="Arial"/>
+          <w:noProof/>
           <w:sz w:val="28"/>
           <w:szCs w:val="28"/>
         </w:rPr>
@@ -9864,6 +9573,7 @@
       <w:r>
         <w:rPr>
           <w:rFonts w:ascii="Arial" w:eastAsia="Arial" w:hAnsi="Arial" w:cs="Arial"/>
+          <w:noProof/>
           <w:sz w:val="28"/>
           <w:szCs w:val="28"/>
         </w:rPr>
@@ -9943,6 +9653,7 @@
       <w:r>
         <w:rPr>
           <w:rFonts w:ascii="Arial" w:eastAsia="Arial" w:hAnsi="Arial" w:cs="Arial"/>
+          <w:noProof/>
           <w:sz w:val="28"/>
           <w:szCs w:val="28"/>
         </w:rPr>
@@ -9996,6 +9707,7 @@
       <w:r>
         <w:rPr>
           <w:rFonts w:ascii="Arial" w:eastAsia="Arial" w:hAnsi="Arial" w:cs="Arial"/>
+          <w:noProof/>
           <w:sz w:val="28"/>
           <w:szCs w:val="28"/>
         </w:rPr>
@@ -10075,6 +9787,7 @@
       <w:r>
         <w:rPr>
           <w:rFonts w:ascii="Arial" w:eastAsia="Arial" w:hAnsi="Arial" w:cs="Arial"/>
+          <w:noProof/>
           <w:sz w:val="28"/>
           <w:szCs w:val="28"/>
         </w:rPr>
@@ -10127,6 +9840,7 @@
       <w:r>
         <w:rPr>
           <w:rFonts w:ascii="Arial" w:eastAsia="Arial" w:hAnsi="Arial" w:cs="Arial"/>
+          <w:noProof/>
           <w:sz w:val="28"/>
           <w:szCs w:val="28"/>
         </w:rPr>
@@ -10215,6 +9929,7 @@
       <w:r>
         <w:rPr>
           <w:rFonts w:ascii="Arial" w:eastAsia="Arial" w:hAnsi="Arial" w:cs="Arial"/>
+          <w:noProof/>
           <w:sz w:val="28"/>
           <w:szCs w:val="28"/>
         </w:rPr>
@@ -10267,6 +9982,7 @@
       <w:r>
         <w:rPr>
           <w:rFonts w:ascii="Arial" w:eastAsia="Arial" w:hAnsi="Arial" w:cs="Arial"/>
+          <w:noProof/>
           <w:sz w:val="28"/>
           <w:szCs w:val="28"/>
         </w:rPr>
@@ -10401,7 +10117,6 @@
         <w:t xml:space="preserve">Utilizaría </w:t>
       </w:r>
       <w:proofErr w:type="spellStart"/>
-      <w:proofErr w:type="gramStart"/>
       <w:r>
         <w:rPr>
           <w:rFonts w:ascii="Arial" w:hAnsi="Arial" w:cs="Arial"/>
@@ -10417,59 +10132,227 @@
           <w:sz w:val="28"/>
           <w:szCs w:val="28"/>
         </w:rPr>
-        <w:t>(</w:t>
-      </w:r>
-      <w:proofErr w:type="gramEnd"/>
-      <w:r>
+        <w:t>() cuando necesito seleccionar muchos elementos que cumplen una misma condición</w:t>
+      </w:r>
+    </w:p>
+    <w:p>
+      <w:pPr>
+        <w:pStyle w:val="Ttulo3"/>
+      </w:pPr>
+      <w:bookmarkStart w:id="56" w:name="_Toc238893520"/>
+      <w:r>
+        <w:t xml:space="preserve">¿Qué diferencia </w:t>
+      </w:r>
+      <w:r>
+        <w:t>en contraste</w:t>
+      </w:r>
+      <w:r>
+        <w:t xml:space="preserve"> entre </w:t>
+      </w:r>
+      <w:proofErr w:type="spellStart"/>
+      <w:r>
+        <w:t>querySelector</w:t>
+      </w:r>
+      <w:proofErr w:type="spellEnd"/>
+      <w:r>
+        <w:t>() y </w:t>
+      </w:r>
+      <w:proofErr w:type="spellStart"/>
+      <w:r>
+        <w:t>querySelectorAll</w:t>
+      </w:r>
+      <w:proofErr w:type="spellEnd"/>
+      <w:r>
+        <w:t>()</w:t>
+      </w:r>
+      <w:bookmarkEnd w:id="56"/>
+    </w:p>
+    <w:p>
+      <w:pPr>
         <w:rPr>
           <w:rFonts w:ascii="Arial" w:hAnsi="Arial" w:cs="Arial"/>
           <w:sz w:val="28"/>
           <w:szCs w:val="28"/>
         </w:rPr>
-        <w:t>) cuando necesito seleccionar muchos elementos que cumplen una misma condición</w:t>
+      </w:pPr>
+      <w:r>
+        <w:rPr>
+          <w:rFonts w:ascii="Arial" w:hAnsi="Arial" w:cs="Arial"/>
+          <w:sz w:val="28"/>
+          <w:szCs w:val="28"/>
+        </w:rPr>
+        <w:t xml:space="preserve">La diferencia es que </w:t>
+      </w:r>
+      <w:proofErr w:type="spellStart"/>
+      <w:r>
+        <w:rPr>
+          <w:rFonts w:ascii="Arial" w:hAnsi="Arial" w:cs="Arial"/>
+          <w:sz w:val="28"/>
+          <w:szCs w:val="28"/>
+        </w:rPr>
+        <w:t>querySelector</w:t>
+      </w:r>
+      <w:proofErr w:type="spellEnd"/>
+      <w:r>
+        <w:rPr>
+          <w:rFonts w:ascii="Arial" w:hAnsi="Arial" w:cs="Arial"/>
+          <w:sz w:val="28"/>
+          <w:szCs w:val="28"/>
+        </w:rPr>
+        <w:t xml:space="preserve">() selecciona únicamente el primer elemento que coincide con el selector, mientras que </w:t>
+      </w:r>
+      <w:proofErr w:type="spellStart"/>
+      <w:r>
+        <w:rPr>
+          <w:rFonts w:ascii="Arial" w:hAnsi="Arial" w:cs="Arial"/>
+          <w:sz w:val="28"/>
+          <w:szCs w:val="28"/>
+        </w:rPr>
+        <w:t>querySelectorAll</w:t>
+      </w:r>
+      <w:proofErr w:type="spellEnd"/>
+      <w:r>
+        <w:rPr>
+          <w:rFonts w:ascii="Arial" w:hAnsi="Arial" w:cs="Arial"/>
+          <w:sz w:val="28"/>
+          <w:szCs w:val="28"/>
+        </w:rPr>
+        <w:t>() selecciona todos los elementos que coinciden</w:t>
       </w:r>
     </w:p>
     <w:p>
       <w:pPr>
         <w:pStyle w:val="Ttulo3"/>
       </w:pPr>
-      <w:bookmarkStart w:id="56" w:name="_Toc238893520"/>
-      <w:r>
-        <w:t xml:space="preserve">¿Qué diferencia </w:t>
-      </w:r>
-      <w:r>
-        <w:t>en contraste</w:t>
-      </w:r>
-      <w:r>
-        <w:t xml:space="preserve"> entre </w:t>
-      </w:r>
+      <w:bookmarkStart w:id="57" w:name="_Toc238893521"/>
+      <w:r>
+        <w:t>¿Qué método te parece más flexible? ¿Por qué?</w:t>
+      </w:r>
+      <w:bookmarkEnd w:id="57"/>
+      <w:r>
+        <w:t> </w:t>
+      </w:r>
+    </w:p>
+    <w:p>
+      <w:pPr>
+        <w:rPr>
+          <w:rFonts w:ascii="Arial" w:hAnsi="Arial" w:cs="Arial"/>
+          <w:sz w:val="28"/>
+          <w:szCs w:val="28"/>
+        </w:rPr>
+      </w:pPr>
       <w:proofErr w:type="spellStart"/>
-      <w:proofErr w:type="gramStart"/>
-      <w:r>
-        <w:t>querySelector</w:t>
+      <w:r>
+        <w:rPr>
+          <w:rFonts w:ascii="Arial" w:hAnsi="Arial" w:cs="Arial"/>
+          <w:sz w:val="28"/>
+          <w:szCs w:val="28"/>
+        </w:rPr>
+        <w:t>querySelectorAll</w:t>
       </w:r>
       <w:proofErr w:type="spellEnd"/>
       <w:r>
-        <w:t>(</w:t>
-      </w:r>
-      <w:proofErr w:type="gramEnd"/>
-      <w:r>
-        <w:t>) y </w:t>
-      </w:r>
+        <w:rPr>
+          <w:rFonts w:ascii="Arial" w:hAnsi="Arial" w:cs="Arial"/>
+          <w:sz w:val="28"/>
+          <w:szCs w:val="28"/>
+        </w:rPr>
+        <w:t>(), porque permite utilizar diferentes tipos de selectores CSS, como ID, clases, etiquetas, atributos y combinaciones</w:t>
+      </w:r>
+    </w:p>
+    <w:p>
+      <w:pPr>
+        <w:pStyle w:val="Ttulo3"/>
+      </w:pPr>
+      <w:bookmarkStart w:id="58" w:name="_Toc238893522"/>
+      <w:r>
+        <w:t>¿Qué método te parece más sencillo? ¿Por qué?</w:t>
+      </w:r>
+      <w:bookmarkEnd w:id="58"/>
+    </w:p>
+    <w:p>
       <w:proofErr w:type="spellStart"/>
-      <w:proofErr w:type="gramStart"/>
-      <w:r>
-        <w:t>querySelectorAll</w:t>
+      <w:r>
+        <w:rPr>
+          <w:sz w:val="28"/>
+          <w:szCs w:val="28"/>
+        </w:rPr>
+        <w:t>getElementById</w:t>
       </w:r>
       <w:proofErr w:type="spellEnd"/>
       <w:r>
-        <w:t>(</w:t>
-      </w:r>
-      <w:proofErr w:type="gramEnd"/>
-      <w:r>
-        <w:t>)</w:t>
-      </w:r>
-      <w:bookmarkEnd w:id="56"/>
+        <w:rPr>
+          <w:sz w:val="28"/>
+          <w:szCs w:val="28"/>
+        </w:rPr>
+        <w:t>(), porque es fácil de entender y utilizar cuando necesito seleccionar un elemento específico</w:t>
+      </w:r>
+    </w:p>
+    <w:p>
+      <w:pPr>
+        <w:pStyle w:val="Ttulo3"/>
+      </w:pPr>
+      <w:bookmarkStart w:id="59" w:name="_Toc238893523"/>
+      <w:r>
+        <w:t>¿Todos los métodos devuelven el mismo tipo de resultado?</w:t>
+      </w:r>
+      <w:bookmarkEnd w:id="59"/>
+      <w:r>
+        <w:t> </w:t>
+      </w:r>
+    </w:p>
+    <w:p>
+      <w:pPr>
+        <w:rPr>
+          <w:sz w:val="28"/>
+          <w:szCs w:val="28"/>
+        </w:rPr>
+      </w:pPr>
+      <w:r>
+        <w:rPr>
+          <w:sz w:val="28"/>
+          <w:szCs w:val="28"/>
+        </w:rPr>
+        <w:t xml:space="preserve">no todos los métodos devuelven el mismo tipo de resultado algunos devuelven un elementos, otros </w:t>
+      </w:r>
+      <w:proofErr w:type="spellStart"/>
+      <w:r>
+        <w:rPr>
+          <w:sz w:val="28"/>
+          <w:szCs w:val="28"/>
+        </w:rPr>
+        <w:t>HTMLCollection</w:t>
+      </w:r>
+      <w:proofErr w:type="spellEnd"/>
+      <w:r>
+        <w:rPr>
+          <w:sz w:val="28"/>
+          <w:szCs w:val="28"/>
+        </w:rPr>
+        <w:t xml:space="preserve">, otro solo devuelve el primer elemento, otro devuelve el </w:t>
+      </w:r>
+      <w:proofErr w:type="spellStart"/>
+      <w:r>
+        <w:rPr>
+          <w:sz w:val="28"/>
+          <w:szCs w:val="28"/>
+        </w:rPr>
+        <w:t>NodeList</w:t>
+      </w:r>
+      <w:proofErr w:type="spellEnd"/>
+    </w:p>
+    <w:p>
+      <w:pPr>
+        <w:pStyle w:val="Ttulo3"/>
+      </w:pPr>
+      <w:bookmarkStart w:id="60" w:name="_Toc238893524"/>
+      <w:r>
+        <w:t>¿Qué sucede si no existe el elemento que estás buscando?</w:t>
+      </w:r>
+      <w:bookmarkEnd w:id="60"/>
+      <w:r>
+        <w:t> </w:t>
+      </w:r>
     </w:p>
     <w:p>
       <w:pPr>
@@ -10485,17 +10368,24 @@
           <w:sz w:val="28"/>
           <w:szCs w:val="28"/>
         </w:rPr>
-        <w:t xml:space="preserve">La diferencia es que </w:t>
+        <w:t xml:space="preserve">Depende del </w:t>
+      </w:r>
+      <w:r>
+        <w:rPr>
+          <w:rFonts w:ascii="Arial" w:hAnsi="Arial" w:cs="Arial"/>
+          <w:sz w:val="28"/>
+          <w:szCs w:val="28"/>
+        </w:rPr>
+        <w:t xml:space="preserve">método utilizado algunos pueden devolver el </w:t>
       </w:r>
       <w:proofErr w:type="spellStart"/>
-      <w:proofErr w:type="gramStart"/>
       <w:r>
         <w:rPr>
           <w:rFonts w:ascii="Arial" w:hAnsi="Arial" w:cs="Arial"/>
           <w:sz w:val="28"/>
           <w:szCs w:val="28"/>
         </w:rPr>
-        <w:t>querySelector</w:t>
+        <w:t>null</w:t>
       </w:r>
       <w:proofErr w:type="spellEnd"/>
       <w:r>
@@ -10504,26 +10394,34 @@
           <w:sz w:val="28"/>
           <w:szCs w:val="28"/>
         </w:rPr>
-        <w:t>(</w:t>
-      </w:r>
-      <w:proofErr w:type="gramEnd"/>
+        <w:t xml:space="preserve"> otros el </w:t>
+      </w:r>
+      <w:proofErr w:type="spellStart"/>
       <w:r>
         <w:rPr>
           <w:rFonts w:ascii="Arial" w:hAnsi="Arial" w:cs="Arial"/>
           <w:sz w:val="28"/>
           <w:szCs w:val="28"/>
         </w:rPr>
-        <w:t xml:space="preserve">) selecciona únicamente el primer elemento que coincide con el selector, mientras que </w:t>
+        <w:t>HTMLCollecion</w:t>
+      </w:r>
+      <w:proofErr w:type="spellEnd"/>
+      <w:r>
+        <w:rPr>
+          <w:rFonts w:ascii="Arial" w:hAnsi="Arial" w:cs="Arial"/>
+          <w:sz w:val="28"/>
+          <w:szCs w:val="28"/>
+        </w:rPr>
+        <w:t xml:space="preserve"> vacío o el </w:t>
       </w:r>
       <w:proofErr w:type="spellStart"/>
-      <w:proofErr w:type="gramStart"/>
       <w:r>
         <w:rPr>
           <w:rFonts w:ascii="Arial" w:hAnsi="Arial" w:cs="Arial"/>
           <w:sz w:val="28"/>
           <w:szCs w:val="28"/>
         </w:rPr>
-        <w:t>querySelectorAll</w:t>
+        <w:t>NodeList</w:t>
       </w:r>
       <w:proofErr w:type="spellEnd"/>
       <w:r>
@@ -10532,27 +10430,18 @@
           <w:sz w:val="28"/>
           <w:szCs w:val="28"/>
         </w:rPr>
-        <w:t>(</w:t>
-      </w:r>
-      <w:proofErr w:type="gramEnd"/>
-      <w:r>
-        <w:rPr>
-          <w:rFonts w:ascii="Arial" w:hAnsi="Arial" w:cs="Arial"/>
-          <w:sz w:val="28"/>
-          <w:szCs w:val="28"/>
-        </w:rPr>
-        <w:t>) selecciona todos los elementos que coinciden</w:t>
+        <w:t xml:space="preserve"> vacío.</w:t>
       </w:r>
     </w:p>
     <w:p>
       <w:pPr>
         <w:pStyle w:val="Ttulo3"/>
       </w:pPr>
-      <w:bookmarkStart w:id="57" w:name="_Toc238893521"/>
-      <w:r>
-        <w:t>¿Qué método te parece más flexible? ¿Por qué?</w:t>
-      </w:r>
-      <w:bookmarkEnd w:id="57"/>
+      <w:bookmarkStart w:id="61" w:name="_Toc238893525"/>
+      <w:r>
+        <w:t>¿Por qué es importante conocer los selectores CSS para trabajar con JavaScript?</w:t>
+      </w:r>
+      <w:bookmarkEnd w:id="61"/>
       <w:r>
         <w:t> </w:t>
       </w:r>
@@ -10560,293 +10449,33 @@
     <w:p>
       <w:pPr>
         <w:rPr>
-          <w:rFonts w:ascii="Arial" w:hAnsi="Arial" w:cs="Arial"/>
-          <w:sz w:val="28"/>
-          <w:szCs w:val="28"/>
-        </w:rPr>
-      </w:pPr>
+          <w:sz w:val="28"/>
+          <w:szCs w:val="28"/>
+        </w:rPr>
+      </w:pPr>
+      <w:r>
+        <w:rPr>
+          <w:sz w:val="28"/>
+          <w:szCs w:val="28"/>
+        </w:rPr>
+        <w:t>permite hacer selecciones más específicas, por ejemplo, buscar elementos por ID, clase, etiqueta, atributo o combinar varias condiciones.</w:t>
+      </w:r>
+    </w:p>
+    <w:p>
+      <w:pPr>
+        <w:pStyle w:val="Ttulo3"/>
+      </w:pPr>
+      <w:bookmarkStart w:id="62" w:name="_Toc238893526"/>
+      <w:r>
+        <w:t>¿En qué situación utilizarías </w:t>
+      </w:r>
       <w:proofErr w:type="spellStart"/>
-      <w:proofErr w:type="gramStart"/>
-      <w:r>
-        <w:rPr>
-          <w:rFonts w:ascii="Arial" w:hAnsi="Arial" w:cs="Arial"/>
-          <w:sz w:val="28"/>
-          <w:szCs w:val="28"/>
-        </w:rPr>
-        <w:t>querySelectorAll</w:t>
+      <w:r>
+        <w:t>getElementsByTagName</w:t>
       </w:r>
       <w:proofErr w:type="spellEnd"/>
       <w:r>
-        <w:rPr>
-          <w:rFonts w:ascii="Arial" w:hAnsi="Arial" w:cs="Arial"/>
-          <w:sz w:val="28"/>
-          <w:szCs w:val="28"/>
-        </w:rPr>
-        <w:t>(</w:t>
-      </w:r>
-      <w:proofErr w:type="gramEnd"/>
-      <w:r>
-        <w:rPr>
-          <w:rFonts w:ascii="Arial" w:hAnsi="Arial" w:cs="Arial"/>
-          <w:sz w:val="28"/>
-          <w:szCs w:val="28"/>
-        </w:rPr>
-        <w:t>), porque permite utilizar diferentes tipos de selectores CSS, como ID, clases, etiquetas, atributos y combinaciones</w:t>
-      </w:r>
-    </w:p>
-    <w:p>
-      <w:pPr>
-        <w:pStyle w:val="Ttulo3"/>
-      </w:pPr>
-      <w:bookmarkStart w:id="58" w:name="_Toc238893522"/>
-      <w:r>
-        <w:t>¿Qué método te parece más sencillo? ¿Por qué?</w:t>
-      </w:r>
-      <w:bookmarkEnd w:id="58"/>
-    </w:p>
-    <w:p>
-      <w:proofErr w:type="spellStart"/>
-      <w:proofErr w:type="gramStart"/>
-      <w:r>
-        <w:rPr>
-          <w:sz w:val="28"/>
-          <w:szCs w:val="28"/>
-        </w:rPr>
-        <w:t>getElementById</w:t>
-      </w:r>
-      <w:proofErr w:type="spellEnd"/>
-      <w:r>
-        <w:rPr>
-          <w:sz w:val="28"/>
-          <w:szCs w:val="28"/>
-        </w:rPr>
-        <w:t>(</w:t>
-      </w:r>
-      <w:proofErr w:type="gramEnd"/>
-      <w:r>
-        <w:rPr>
-          <w:sz w:val="28"/>
-          <w:szCs w:val="28"/>
-        </w:rPr>
-        <w:t>), porque es fácil de entender y utilizar cuando necesito seleccionar un elemento específico</w:t>
-      </w:r>
-    </w:p>
-    <w:p>
-      <w:pPr>
-        <w:pStyle w:val="Ttulo3"/>
-      </w:pPr>
-      <w:bookmarkStart w:id="59" w:name="_Toc238893523"/>
-      <w:r>
-        <w:t>¿Todos los métodos devuelven el mismo tipo de resultado?</w:t>
-      </w:r>
-      <w:bookmarkEnd w:id="59"/>
-      <w:r>
-        <w:t> </w:t>
-      </w:r>
-    </w:p>
-    <w:p>
-      <w:pPr>
-        <w:rPr>
-          <w:sz w:val="28"/>
-          <w:szCs w:val="28"/>
-        </w:rPr>
-      </w:pPr>
-      <w:r>
-        <w:rPr>
-          <w:sz w:val="28"/>
-          <w:szCs w:val="28"/>
-        </w:rPr>
-        <w:t>no todos los métodos devuelven el mismo tipo de resultado</w:t>
-      </w:r>
-      <w:r>
-        <w:rPr>
-          <w:sz w:val="28"/>
-          <w:szCs w:val="28"/>
-        </w:rPr>
-        <w:t xml:space="preserve"> algunos devuelven </w:t>
-      </w:r>
-      <w:proofErr w:type="gramStart"/>
-      <w:r>
-        <w:rPr>
-          <w:sz w:val="28"/>
-          <w:szCs w:val="28"/>
-        </w:rPr>
-        <w:t>un elementos</w:t>
-      </w:r>
-      <w:proofErr w:type="gramEnd"/>
-      <w:r>
-        <w:rPr>
-          <w:sz w:val="28"/>
-          <w:szCs w:val="28"/>
-        </w:rPr>
-        <w:t xml:space="preserve">, otros </w:t>
-      </w:r>
-      <w:proofErr w:type="spellStart"/>
-      <w:r>
-        <w:rPr>
-          <w:sz w:val="28"/>
-          <w:szCs w:val="28"/>
-        </w:rPr>
-        <w:t>HTMLCollection</w:t>
-      </w:r>
-      <w:proofErr w:type="spellEnd"/>
-      <w:r>
-        <w:rPr>
-          <w:sz w:val="28"/>
-          <w:szCs w:val="28"/>
-        </w:rPr>
-        <w:t xml:space="preserve">, otro solo devuelve el primer elemento, otro devuelve el </w:t>
-      </w:r>
-      <w:proofErr w:type="spellStart"/>
-      <w:r>
-        <w:rPr>
-          <w:sz w:val="28"/>
-          <w:szCs w:val="28"/>
-        </w:rPr>
-        <w:t>NodeList</w:t>
-      </w:r>
-      <w:proofErr w:type="spellEnd"/>
-    </w:p>
-    <w:p>
-      <w:pPr>
-        <w:pStyle w:val="Ttulo3"/>
-      </w:pPr>
-      <w:bookmarkStart w:id="60" w:name="_Toc238893524"/>
-      <w:r>
-        <w:t>¿Qué sucede si no existe el elemento que estás buscando?</w:t>
-      </w:r>
-      <w:bookmarkEnd w:id="60"/>
-      <w:r>
-        <w:t> </w:t>
-      </w:r>
-    </w:p>
-    <w:p>
-      <w:pPr>
-        <w:rPr>
-          <w:rFonts w:ascii="Arial" w:hAnsi="Arial" w:cs="Arial"/>
-          <w:sz w:val="28"/>
-          <w:szCs w:val="28"/>
-        </w:rPr>
-      </w:pPr>
-      <w:r>
-        <w:rPr>
-          <w:rFonts w:ascii="Arial" w:hAnsi="Arial" w:cs="Arial"/>
-          <w:sz w:val="28"/>
-          <w:szCs w:val="28"/>
-        </w:rPr>
-        <w:t xml:space="preserve">Depende del </w:t>
-      </w:r>
-      <w:r>
-        <w:rPr>
-          <w:rFonts w:ascii="Arial" w:hAnsi="Arial" w:cs="Arial"/>
-          <w:sz w:val="28"/>
-          <w:szCs w:val="28"/>
-        </w:rPr>
-        <w:t xml:space="preserve">método utilizado algunos pueden devolver el </w:t>
-      </w:r>
-      <w:proofErr w:type="spellStart"/>
-      <w:r>
-        <w:rPr>
-          <w:rFonts w:ascii="Arial" w:hAnsi="Arial" w:cs="Arial"/>
-          <w:sz w:val="28"/>
-          <w:szCs w:val="28"/>
-        </w:rPr>
-        <w:t>null</w:t>
-      </w:r>
-      <w:proofErr w:type="spellEnd"/>
-      <w:r>
-        <w:rPr>
-          <w:rFonts w:ascii="Arial" w:hAnsi="Arial" w:cs="Arial"/>
-          <w:sz w:val="28"/>
-          <w:szCs w:val="28"/>
-        </w:rPr>
-        <w:t xml:space="preserve"> otros el </w:t>
-      </w:r>
-      <w:proofErr w:type="spellStart"/>
-      <w:r>
-        <w:rPr>
-          <w:rFonts w:ascii="Arial" w:hAnsi="Arial" w:cs="Arial"/>
-          <w:sz w:val="28"/>
-          <w:szCs w:val="28"/>
-        </w:rPr>
-        <w:t>HTMLCollecion</w:t>
-      </w:r>
-      <w:proofErr w:type="spellEnd"/>
-      <w:r>
-        <w:rPr>
-          <w:rFonts w:ascii="Arial" w:hAnsi="Arial" w:cs="Arial"/>
-          <w:sz w:val="28"/>
-          <w:szCs w:val="28"/>
-        </w:rPr>
-        <w:t xml:space="preserve"> vacío o el </w:t>
-      </w:r>
-      <w:proofErr w:type="spellStart"/>
-      <w:r>
-        <w:rPr>
-          <w:rFonts w:ascii="Arial" w:hAnsi="Arial" w:cs="Arial"/>
-          <w:sz w:val="28"/>
-          <w:szCs w:val="28"/>
-        </w:rPr>
-        <w:t>NodeList</w:t>
-      </w:r>
-      <w:proofErr w:type="spellEnd"/>
-      <w:r>
-        <w:rPr>
-          <w:rFonts w:ascii="Arial" w:hAnsi="Arial" w:cs="Arial"/>
-          <w:sz w:val="28"/>
-          <w:szCs w:val="28"/>
-        </w:rPr>
-        <w:t xml:space="preserve"> vacío.</w:t>
-      </w:r>
-    </w:p>
-    <w:p>
-      <w:pPr>
-        <w:pStyle w:val="Ttulo3"/>
-      </w:pPr>
-      <w:bookmarkStart w:id="61" w:name="_Toc238893525"/>
-      <w:r>
-        <w:t>¿Por qué es importante conocer los selectores CSS para trabajar con JavaScript?</w:t>
-      </w:r>
-      <w:bookmarkEnd w:id="61"/>
-      <w:r>
-        <w:t> </w:t>
-      </w:r>
-    </w:p>
-    <w:p>
-      <w:pPr>
-        <w:rPr>
-          <w:sz w:val="28"/>
-          <w:szCs w:val="28"/>
-        </w:rPr>
-      </w:pPr>
-      <w:r>
-        <w:rPr>
-          <w:sz w:val="28"/>
-          <w:szCs w:val="28"/>
-        </w:rPr>
-        <w:t>permite hacer selecciones más específicas, por ejemplo, buscar elementos por ID, clase, etiqueta, atributo o combinar varias condiciones.</w:t>
-      </w:r>
-    </w:p>
-    <w:p>
-      <w:pPr>
-        <w:pStyle w:val="Ttulo3"/>
-      </w:pPr>
-      <w:bookmarkStart w:id="62" w:name="_Toc238893526"/>
-      <w:r>
-        <w:t>¿En qué situación utilizarías </w:t>
-      </w:r>
-      <w:proofErr w:type="spellStart"/>
-      <w:proofErr w:type="gramStart"/>
-      <w:r>
-        <w:t>getElementsByTagName</w:t>
-      </w:r>
-      <w:proofErr w:type="spellEnd"/>
-      <w:r>
-        <w:t>(</w:t>
-      </w:r>
-      <w:proofErr w:type="gramEnd"/>
-      <w:r>
-        <w:t>)?</w:t>
+        <w:t>()?</w:t>
       </w:r>
       <w:bookmarkEnd w:id="62"/>
       <w:r>
@@ -10881,17 +10510,12 @@
         <w:t>¿En qué situación preferirías </w:t>
       </w:r>
       <w:proofErr w:type="spellStart"/>
-      <w:proofErr w:type="gramStart"/>
       <w:r>
         <w:t>querySelectorAll</w:t>
       </w:r>
       <w:proofErr w:type="spellEnd"/>
       <w:r>
-        <w:t>(</w:t>
-      </w:r>
-      <w:proofErr w:type="gramEnd"/>
-      <w:r>
-        <w:t>)?</w:t>
+        <w:t>()?</w:t>
       </w:r>
       <w:bookmarkEnd w:id="63"/>
       <w:r>
@@ -10980,7 +10604,6 @@
         <w:t>“Con </w:t>
       </w:r>
       <w:proofErr w:type="spellStart"/>
-      <w:proofErr w:type="gramStart"/>
       <w:r>
         <w:rPr>
           <w:rFonts w:ascii="Arial" w:eastAsia="Arial" w:hAnsi="Arial" w:cs="Arial"/>
@@ -10996,16 +10619,7 @@
           <w:sz w:val="28"/>
           <w:szCs w:val="28"/>
         </w:rPr>
-        <w:t>(</w:t>
-      </w:r>
-      <w:proofErr w:type="gramEnd"/>
-      <w:r>
-        <w:rPr>
-          <w:rFonts w:ascii="Arial" w:eastAsia="Arial" w:hAnsi="Arial" w:cs="Arial"/>
-          <w:sz w:val="28"/>
-          <w:szCs w:val="28"/>
-        </w:rPr>
-        <w:t>) es suficiente para trabajar con el DOM, porque todos los elementos importantes pueden tener un ID.” </w:t>
+        <w:t>() es suficiente para trabajar con el DOM, porque todos los elementos importantes pueden tener un ID.” </w:t>
       </w:r>
     </w:p>
     <w:p>
@@ -11069,7 +10683,6 @@
         <w:t xml:space="preserve">No estoy de acuerdo, porque </w:t>
       </w:r>
       <w:proofErr w:type="spellStart"/>
-      <w:proofErr w:type="gramStart"/>
       <w:r>
         <w:rPr>
           <w:sz w:val="28"/>
@@ -11083,15 +10696,7 @@
           <w:sz w:val="28"/>
           <w:szCs w:val="28"/>
         </w:rPr>
-        <w:t>(</w:t>
-      </w:r>
-      <w:proofErr w:type="gramEnd"/>
-      <w:r>
-        <w:rPr>
-          <w:sz w:val="28"/>
-          <w:szCs w:val="28"/>
-        </w:rPr>
-        <w:t>) solo permite seleccionar un elemento mediante su id, y no siempre necesitamos asignar un ID a cada elemento.</w:t>
+        <w:t>() solo permite seleccionar un elemento mediante su id, y no siempre necesitamos asignar un ID a cada elemento.</w:t>
       </w:r>
       <w:r>
         <w:rPr>
@@ -11101,7 +10706,6 @@
         <w:t xml:space="preserve"> </w:t>
       </w:r>
       <w:proofErr w:type="spellStart"/>
-      <w:proofErr w:type="gramStart"/>
       <w:r>
         <w:rPr>
           <w:sz w:val="28"/>
@@ -11115,15 +10719,7 @@
           <w:sz w:val="28"/>
           <w:szCs w:val="28"/>
         </w:rPr>
-        <w:t>(</w:t>
-      </w:r>
-      <w:proofErr w:type="gramEnd"/>
-      <w:r>
-        <w:rPr>
-          <w:sz w:val="28"/>
-          <w:szCs w:val="28"/>
-        </w:rPr>
-        <w:t>) es útil cuando necesitamos seleccionar un elemento específico, pero no es suficiente para trabajar con todo tipo de elementos y situaciones en el DOM.</w:t>
+        <w:t>() es útil cuando necesitamos seleccionar un elemento específico, pero no es suficiente para trabajar con todo tipo de elementos y situaciones en el DOM.</w:t>
       </w:r>
     </w:p>
     <w:p>
@@ -11209,6 +10805,59 @@
           <w:szCs w:val="28"/>
         </w:rPr>
         <w:t>El reto consiste en que, utilizando únicamente los métodos investigados, puedas: </w:t>
+      </w:r>
+    </w:p>
+    <w:p>
+      <w:pPr>
+        <w:spacing w:after="0" w:line="240" w:lineRule="auto"/>
+        <w:rPr>
+          <w:rFonts w:ascii="Arial" w:eastAsia="Arial" w:hAnsi="Arial" w:cs="Arial"/>
+          <w:sz w:val="28"/>
+          <w:szCs w:val="28"/>
+        </w:rPr>
+      </w:pPr>
+      <w:r>
+        <w:rPr>
+          <w:rFonts w:ascii="Arial" w:eastAsia="Arial" w:hAnsi="Arial" w:cs="Arial"/>
+          <w:sz w:val="28"/>
+          <w:szCs w:val="28"/>
+        </w:rPr>
+        <w:lastRenderedPageBreak/>
+        <w:drawing>
+          <wp:inline distT="0" distB="0" distL="0" distR="0" wp14:anchorId="43F45D9B" wp14:editId="10B7DD60">
+            <wp:extent cx="2911092" cy="6424217"/>
+            <wp:effectExtent l="0" t="0" r="3810" b="0"/>
+            <wp:docPr id="1644022610" name="Imagen 1"/>
+            <wp:cNvGraphicFramePr>
+              <a:graphicFrameLocks xmlns:a="http://schemas.openxmlformats.org/drawingml/2006/main" noChangeAspect="1"/>
+            </wp:cNvGraphicFramePr>
+            <a:graphic xmlns:a="http://schemas.openxmlformats.org/drawingml/2006/main">
+              <a:graphicData uri="http://schemas.openxmlformats.org/drawingml/2006/picture">
+                <pic:pic xmlns:pic="http://schemas.openxmlformats.org/drawingml/2006/picture">
+                  <pic:nvPicPr>
+                    <pic:cNvPr id="1644022610" name=""/>
+                    <pic:cNvPicPr/>
+                  </pic:nvPicPr>
+                  <pic:blipFill>
+                    <a:blip r:embed="rId21"/>
+                    <a:stretch>
+                      <a:fillRect/>
+                    </a:stretch>
+                  </pic:blipFill>
+                  <pic:spPr>
+                    <a:xfrm>
+                      <a:off x="0" y="0"/>
+                      <a:ext cx="2911092" cy="6424217"/>
+                    </a:xfrm>
+                    <a:prstGeom prst="rect">
+                      <a:avLst/>
+                    </a:prstGeom>
+                  </pic:spPr>
+                </pic:pic>
+              </a:graphicData>
+            </a:graphic>
+          </wp:inline>
+        </w:drawing>
       </w:r>
     </w:p>
     <w:p>
@@ -11235,6 +10884,110 @@
     </w:p>
     <w:p>
       <w:pPr>
+        <w:spacing w:after="0" w:line="240" w:lineRule="auto"/>
+        <w:rPr>
+          <w:rFonts w:ascii="Arial" w:eastAsia="Arial" w:hAnsi="Arial" w:cs="Arial"/>
+          <w:sz w:val="28"/>
+          <w:szCs w:val="28"/>
+        </w:rPr>
+      </w:pPr>
+      <w:r>
+        <w:rPr>
+          <w:rFonts w:ascii="Arial" w:eastAsia="Arial" w:hAnsi="Arial" w:cs="Arial"/>
+          <w:sz w:val="28"/>
+          <w:szCs w:val="28"/>
+        </w:rPr>
+        <w:drawing>
+          <wp:inline distT="0" distB="0" distL="0" distR="0" wp14:anchorId="1261BC03" wp14:editId="4A767291">
+            <wp:extent cx="4168501" cy="548688"/>
+            <wp:effectExtent l="0" t="0" r="3810" b="3810"/>
+            <wp:docPr id="1424351043" name="Imagen 1"/>
+            <wp:cNvGraphicFramePr>
+              <a:graphicFrameLocks xmlns:a="http://schemas.openxmlformats.org/drawingml/2006/main" noChangeAspect="1"/>
+            </wp:cNvGraphicFramePr>
+            <a:graphic xmlns:a="http://schemas.openxmlformats.org/drawingml/2006/main">
+              <a:graphicData uri="http://schemas.openxmlformats.org/drawingml/2006/picture">
+                <pic:pic xmlns:pic="http://schemas.openxmlformats.org/drawingml/2006/picture">
+                  <pic:nvPicPr>
+                    <pic:cNvPr id="1424351043" name=""/>
+                    <pic:cNvPicPr/>
+                  </pic:nvPicPr>
+                  <pic:blipFill>
+                    <a:blip r:embed="rId22"/>
+                    <a:stretch>
+                      <a:fillRect/>
+                    </a:stretch>
+                  </pic:blipFill>
+                  <pic:spPr>
+                    <a:xfrm>
+                      <a:off x="0" y="0"/>
+                      <a:ext cx="4168501" cy="548688"/>
+                    </a:xfrm>
+                    <a:prstGeom prst="rect">
+                      <a:avLst/>
+                    </a:prstGeom>
+                  </pic:spPr>
+                </pic:pic>
+              </a:graphicData>
+            </a:graphic>
+          </wp:inline>
+        </w:drawing>
+      </w:r>
+    </w:p>
+    <w:p>
+      <w:pPr>
+        <w:spacing w:after="0" w:line="240" w:lineRule="auto"/>
+        <w:rPr>
+          <w:rFonts w:ascii="Arial" w:eastAsia="Arial" w:hAnsi="Arial" w:cs="Arial"/>
+          <w:sz w:val="28"/>
+          <w:szCs w:val="28"/>
+        </w:rPr>
+      </w:pPr>
+      <w:r>
+        <w:rPr>
+          <w:rFonts w:ascii="Arial" w:eastAsia="Arial" w:hAnsi="Arial" w:cs="Arial"/>
+          <w:sz w:val="28"/>
+          <w:szCs w:val="28"/>
+        </w:rPr>
+        <w:drawing>
+          <wp:inline distT="0" distB="0" distL="0" distR="0" wp14:anchorId="1B63ECD4" wp14:editId="63814B7E">
+            <wp:extent cx="5044877" cy="167655"/>
+            <wp:effectExtent l="0" t="0" r="3810" b="3810"/>
+            <wp:docPr id="13978158" name="Imagen 1"/>
+            <wp:cNvGraphicFramePr>
+              <a:graphicFrameLocks xmlns:a="http://schemas.openxmlformats.org/drawingml/2006/main" noChangeAspect="1"/>
+            </wp:cNvGraphicFramePr>
+            <a:graphic xmlns:a="http://schemas.openxmlformats.org/drawingml/2006/main">
+              <a:graphicData uri="http://schemas.openxmlformats.org/drawingml/2006/picture">
+                <pic:pic xmlns:pic="http://schemas.openxmlformats.org/drawingml/2006/picture">
+                  <pic:nvPicPr>
+                    <pic:cNvPr id="13978158" name=""/>
+                    <pic:cNvPicPr/>
+                  </pic:nvPicPr>
+                  <pic:blipFill>
+                    <a:blip r:embed="rId23"/>
+                    <a:stretch>
+                      <a:fillRect/>
+                    </a:stretch>
+                  </pic:blipFill>
+                  <pic:spPr>
+                    <a:xfrm>
+                      <a:off x="0" y="0"/>
+                      <a:ext cx="5044877" cy="167655"/>
+                    </a:xfrm>
+                    <a:prstGeom prst="rect">
+                      <a:avLst/>
+                    </a:prstGeom>
+                  </pic:spPr>
+                </pic:pic>
+              </a:graphicData>
+            </a:graphic>
+          </wp:inline>
+        </w:drawing>
+      </w:r>
+    </w:p>
+    <w:p>
+      <w:pPr>
         <w:numPr>
           <w:ilvl w:val="0"/>
           <w:numId w:val="15"/>
@@ -11252,7 +11005,112 @@
           <w:sz w:val="28"/>
           <w:szCs w:val="28"/>
         </w:rPr>
+        <w:lastRenderedPageBreak/>
         <w:t>Encontrar varios elementos. </w:t>
+      </w:r>
+    </w:p>
+    <w:p>
+      <w:pPr>
+        <w:spacing w:after="0" w:line="240" w:lineRule="auto"/>
+        <w:rPr>
+          <w:rFonts w:ascii="Arial" w:eastAsia="Arial" w:hAnsi="Arial" w:cs="Arial"/>
+          <w:sz w:val="28"/>
+          <w:szCs w:val="28"/>
+        </w:rPr>
+      </w:pPr>
+      <w:r>
+        <w:rPr>
+          <w:rFonts w:ascii="Arial" w:eastAsia="Arial" w:hAnsi="Arial" w:cs="Arial"/>
+          <w:sz w:val="28"/>
+          <w:szCs w:val="28"/>
+        </w:rPr>
+        <w:drawing>
+          <wp:inline distT="0" distB="0" distL="0" distR="0" wp14:anchorId="15DC3BE2" wp14:editId="3CF216E8">
+            <wp:extent cx="5067739" cy="609653"/>
+            <wp:effectExtent l="0" t="0" r="0" b="0"/>
+            <wp:docPr id="213532070" name="Imagen 1"/>
+            <wp:cNvGraphicFramePr>
+              <a:graphicFrameLocks xmlns:a="http://schemas.openxmlformats.org/drawingml/2006/main" noChangeAspect="1"/>
+            </wp:cNvGraphicFramePr>
+            <a:graphic xmlns:a="http://schemas.openxmlformats.org/drawingml/2006/main">
+              <a:graphicData uri="http://schemas.openxmlformats.org/drawingml/2006/picture">
+                <pic:pic xmlns:pic="http://schemas.openxmlformats.org/drawingml/2006/picture">
+                  <pic:nvPicPr>
+                    <pic:cNvPr id="213532070" name=""/>
+                    <pic:cNvPicPr/>
+                  </pic:nvPicPr>
+                  <pic:blipFill>
+                    <a:blip r:embed="rId24"/>
+                    <a:stretch>
+                      <a:fillRect/>
+                    </a:stretch>
+                  </pic:blipFill>
+                  <pic:spPr>
+                    <a:xfrm>
+                      <a:off x="0" y="0"/>
+                      <a:ext cx="5067739" cy="609653"/>
+                    </a:xfrm>
+                    <a:prstGeom prst="rect">
+                      <a:avLst/>
+                    </a:prstGeom>
+                  </pic:spPr>
+                </pic:pic>
+              </a:graphicData>
+            </a:graphic>
+          </wp:inline>
+        </w:drawing>
+      </w:r>
+    </w:p>
+    <w:p>
+      <w:pPr>
+        <w:spacing w:after="0" w:line="240" w:lineRule="auto"/>
+        <w:rPr>
+          <w:rFonts w:ascii="Arial" w:eastAsia="Arial" w:hAnsi="Arial" w:cs="Arial"/>
+          <w:sz w:val="28"/>
+          <w:szCs w:val="28"/>
+        </w:rPr>
+      </w:pPr>
+      <w:r>
+        <w:rPr>
+          <w:rFonts w:ascii="Arial" w:eastAsia="Arial" w:hAnsi="Arial" w:cs="Arial"/>
+          <w:sz w:val="28"/>
+          <w:szCs w:val="28"/>
+        </w:rPr>
+        <w:drawing>
+          <wp:inline distT="0" distB="0" distL="0" distR="0" wp14:anchorId="1D49CD4A" wp14:editId="33555831">
+            <wp:extent cx="5044877" cy="1120237"/>
+            <wp:effectExtent l="0" t="0" r="3810" b="3810"/>
+            <wp:docPr id="262416082" name="Imagen 1"/>
+            <wp:cNvGraphicFramePr>
+              <a:graphicFrameLocks xmlns:a="http://schemas.openxmlformats.org/drawingml/2006/main" noChangeAspect="1"/>
+            </wp:cNvGraphicFramePr>
+            <a:graphic xmlns:a="http://schemas.openxmlformats.org/drawingml/2006/main">
+              <a:graphicData uri="http://schemas.openxmlformats.org/drawingml/2006/picture">
+                <pic:pic xmlns:pic="http://schemas.openxmlformats.org/drawingml/2006/picture">
+                  <pic:nvPicPr>
+                    <pic:cNvPr id="262416082" name=""/>
+                    <pic:cNvPicPr/>
+                  </pic:nvPicPr>
+                  <pic:blipFill>
+                    <a:blip r:embed="rId25"/>
+                    <a:stretch>
+                      <a:fillRect/>
+                    </a:stretch>
+                  </pic:blipFill>
+                  <pic:spPr>
+                    <a:xfrm>
+                      <a:off x="0" y="0"/>
+                      <a:ext cx="5044877" cy="1120237"/>
+                    </a:xfrm>
+                    <a:prstGeom prst="rect">
+                      <a:avLst/>
+                    </a:prstGeom>
+                  </pic:spPr>
+                </pic:pic>
+              </a:graphicData>
+            </a:graphic>
+          </wp:inline>
+        </w:drawing>
       </w:r>
     </w:p>
     <w:p>
@@ -11279,6 +11137,110 @@
     </w:p>
     <w:p>
       <w:pPr>
+        <w:spacing w:after="0" w:line="240" w:lineRule="auto"/>
+        <w:rPr>
+          <w:rFonts w:ascii="Arial" w:eastAsia="Arial" w:hAnsi="Arial" w:cs="Arial"/>
+          <w:sz w:val="28"/>
+          <w:szCs w:val="28"/>
+        </w:rPr>
+      </w:pPr>
+      <w:r>
+        <w:rPr>
+          <w:rFonts w:ascii="Arial" w:eastAsia="Arial" w:hAnsi="Arial" w:cs="Arial"/>
+          <w:sz w:val="28"/>
+          <w:szCs w:val="28"/>
+        </w:rPr>
+        <w:drawing>
+          <wp:inline distT="0" distB="0" distL="0" distR="0" wp14:anchorId="5CDA6797" wp14:editId="41C4E83E">
+            <wp:extent cx="3825572" cy="586791"/>
+            <wp:effectExtent l="0" t="0" r="3810" b="3810"/>
+            <wp:docPr id="754139364" name="Imagen 1"/>
+            <wp:cNvGraphicFramePr>
+              <a:graphicFrameLocks xmlns:a="http://schemas.openxmlformats.org/drawingml/2006/main" noChangeAspect="1"/>
+            </wp:cNvGraphicFramePr>
+            <a:graphic xmlns:a="http://schemas.openxmlformats.org/drawingml/2006/main">
+              <a:graphicData uri="http://schemas.openxmlformats.org/drawingml/2006/picture">
+                <pic:pic xmlns:pic="http://schemas.openxmlformats.org/drawingml/2006/picture">
+                  <pic:nvPicPr>
+                    <pic:cNvPr id="754139364" name=""/>
+                    <pic:cNvPicPr/>
+                  </pic:nvPicPr>
+                  <pic:blipFill>
+                    <a:blip r:embed="rId26"/>
+                    <a:stretch>
+                      <a:fillRect/>
+                    </a:stretch>
+                  </pic:blipFill>
+                  <pic:spPr>
+                    <a:xfrm>
+                      <a:off x="0" y="0"/>
+                      <a:ext cx="3825572" cy="586791"/>
+                    </a:xfrm>
+                    <a:prstGeom prst="rect">
+                      <a:avLst/>
+                    </a:prstGeom>
+                  </pic:spPr>
+                </pic:pic>
+              </a:graphicData>
+            </a:graphic>
+          </wp:inline>
+        </w:drawing>
+      </w:r>
+    </w:p>
+    <w:p>
+      <w:pPr>
+        <w:spacing w:after="0" w:line="240" w:lineRule="auto"/>
+        <w:rPr>
+          <w:rFonts w:ascii="Arial" w:eastAsia="Arial" w:hAnsi="Arial" w:cs="Arial"/>
+          <w:sz w:val="28"/>
+          <w:szCs w:val="28"/>
+        </w:rPr>
+      </w:pPr>
+      <w:r>
+        <w:rPr>
+          <w:rFonts w:ascii="Arial" w:eastAsia="Arial" w:hAnsi="Arial" w:cs="Arial"/>
+          <w:sz w:val="28"/>
+          <w:szCs w:val="28"/>
+        </w:rPr>
+        <w:drawing>
+          <wp:inline distT="0" distB="0" distL="0" distR="0" wp14:anchorId="10EF490E" wp14:editId="46D268DD">
+            <wp:extent cx="4961050" cy="1265030"/>
+            <wp:effectExtent l="0" t="0" r="0" b="0"/>
+            <wp:docPr id="111453742" name="Imagen 1"/>
+            <wp:cNvGraphicFramePr>
+              <a:graphicFrameLocks xmlns:a="http://schemas.openxmlformats.org/drawingml/2006/main" noChangeAspect="1"/>
+            </wp:cNvGraphicFramePr>
+            <a:graphic xmlns:a="http://schemas.openxmlformats.org/drawingml/2006/main">
+              <a:graphicData uri="http://schemas.openxmlformats.org/drawingml/2006/picture">
+                <pic:pic xmlns:pic="http://schemas.openxmlformats.org/drawingml/2006/picture">
+                  <pic:nvPicPr>
+                    <pic:cNvPr id="111453742" name=""/>
+                    <pic:cNvPicPr/>
+                  </pic:nvPicPr>
+                  <pic:blipFill>
+                    <a:blip r:embed="rId27"/>
+                    <a:stretch>
+                      <a:fillRect/>
+                    </a:stretch>
+                  </pic:blipFill>
+                  <pic:spPr>
+                    <a:xfrm>
+                      <a:off x="0" y="0"/>
+                      <a:ext cx="4961050" cy="1265030"/>
+                    </a:xfrm>
+                    <a:prstGeom prst="rect">
+                      <a:avLst/>
+                    </a:prstGeom>
+                  </pic:spPr>
+                </pic:pic>
+              </a:graphicData>
+            </a:graphic>
+          </wp:inline>
+        </w:drawing>
+      </w:r>
+    </w:p>
+    <w:p>
+      <w:pPr>
         <w:numPr>
           <w:ilvl w:val="0"/>
           <w:numId w:val="15"/>
@@ -11296,7 +11258,110 @@
           <w:sz w:val="28"/>
           <w:szCs w:val="28"/>
         </w:rPr>
-        <w:t>Encontrar elementos por etiqueta. </w:t>
+        <w:t>Encontrar elementos por etiqueta.</w:t>
+      </w:r>
+    </w:p>
+    <w:p>
+      <w:pPr>
+        <w:spacing w:after="0" w:line="240" w:lineRule="auto"/>
+        <w:rPr>
+          <w:rFonts w:ascii="Arial" w:eastAsia="Arial" w:hAnsi="Arial" w:cs="Arial"/>
+          <w:sz w:val="28"/>
+          <w:szCs w:val="28"/>
+        </w:rPr>
+      </w:pPr>
+      <w:r>
+        <w:rPr>
+          <w:rFonts w:ascii="Arial" w:eastAsia="Arial" w:hAnsi="Arial" w:cs="Arial"/>
+          <w:sz w:val="28"/>
+          <w:szCs w:val="28"/>
+        </w:rPr>
+        <w:lastRenderedPageBreak/>
+        <w:t> </w:t>
+      </w:r>
+      <w:r>
+        <w:rPr>
+          <w:rFonts w:ascii="Arial" w:eastAsia="Arial" w:hAnsi="Arial" w:cs="Arial"/>
+          <w:sz w:val="28"/>
+          <w:szCs w:val="28"/>
+        </w:rPr>
+        <w:drawing>
+          <wp:inline distT="0" distB="0" distL="0" distR="0" wp14:anchorId="0CA635A4" wp14:editId="5F648AAD">
+            <wp:extent cx="4138019" cy="670618"/>
+            <wp:effectExtent l="0" t="0" r="0" b="0"/>
+            <wp:docPr id="1396890342" name="Imagen 1"/>
+            <wp:cNvGraphicFramePr>
+              <a:graphicFrameLocks xmlns:a="http://schemas.openxmlformats.org/drawingml/2006/main" noChangeAspect="1"/>
+            </wp:cNvGraphicFramePr>
+            <a:graphic xmlns:a="http://schemas.openxmlformats.org/drawingml/2006/main">
+              <a:graphicData uri="http://schemas.openxmlformats.org/drawingml/2006/picture">
+                <pic:pic xmlns:pic="http://schemas.openxmlformats.org/drawingml/2006/picture">
+                  <pic:nvPicPr>
+                    <pic:cNvPr id="1396890342" name=""/>
+                    <pic:cNvPicPr/>
+                  </pic:nvPicPr>
+                  <pic:blipFill>
+                    <a:blip r:embed="rId28"/>
+                    <a:stretch>
+                      <a:fillRect/>
+                    </a:stretch>
+                  </pic:blipFill>
+                  <pic:spPr>
+                    <a:xfrm>
+                      <a:off x="0" y="0"/>
+                      <a:ext cx="4138019" cy="670618"/>
+                    </a:xfrm>
+                    <a:prstGeom prst="rect">
+                      <a:avLst/>
+                    </a:prstGeom>
+                  </pic:spPr>
+                </pic:pic>
+              </a:graphicData>
+            </a:graphic>
+          </wp:inline>
+        </w:drawing>
+      </w:r>
+      <w:r>
+        <w:rPr>
+          <w:rFonts w:ascii="Arial" w:eastAsia="Arial" w:hAnsi="Arial" w:cs="Arial"/>
+          <w:sz w:val="28"/>
+          <w:szCs w:val="28"/>
+        </w:rPr>
+        <w:drawing>
+          <wp:inline distT="0" distB="0" distL="0" distR="0" wp14:anchorId="1A20D6D6" wp14:editId="78DE9306">
+            <wp:extent cx="4999153" cy="2682472"/>
+            <wp:effectExtent l="0" t="0" r="0" b="3810"/>
+            <wp:docPr id="781792928" name="Imagen 1"/>
+            <wp:cNvGraphicFramePr>
+              <a:graphicFrameLocks xmlns:a="http://schemas.openxmlformats.org/drawingml/2006/main" noChangeAspect="1"/>
+            </wp:cNvGraphicFramePr>
+            <a:graphic xmlns:a="http://schemas.openxmlformats.org/drawingml/2006/main">
+              <a:graphicData uri="http://schemas.openxmlformats.org/drawingml/2006/picture">
+                <pic:pic xmlns:pic="http://schemas.openxmlformats.org/drawingml/2006/picture">
+                  <pic:nvPicPr>
+                    <pic:cNvPr id="781792928" name=""/>
+                    <pic:cNvPicPr/>
+                  </pic:nvPicPr>
+                  <pic:blipFill>
+                    <a:blip r:embed="rId29"/>
+                    <a:stretch>
+                      <a:fillRect/>
+                    </a:stretch>
+                  </pic:blipFill>
+                  <pic:spPr>
+                    <a:xfrm>
+                      <a:off x="0" y="0"/>
+                      <a:ext cx="4999153" cy="2682472"/>
+                    </a:xfrm>
+                    <a:prstGeom prst="rect">
+                      <a:avLst/>
+                    </a:prstGeom>
+                  </pic:spPr>
+                </pic:pic>
+              </a:graphicData>
+            </a:graphic>
+          </wp:inline>
+        </w:drawing>
       </w:r>
     </w:p>
     <w:p>
@@ -11336,11 +11401,129 @@
           <w:sz w:val="28"/>
           <w:szCs w:val="28"/>
         </w:rPr>
-        <w:t>Entregar Documento del Taller y repositorio GitHub</w:t>
-      </w:r>
+        <w:drawing>
+          <wp:inline distT="0" distB="0" distL="0" distR="0" wp14:anchorId="352C02BE" wp14:editId="7471FA47">
+            <wp:extent cx="5540220" cy="762066"/>
+            <wp:effectExtent l="0" t="0" r="3810" b="0"/>
+            <wp:docPr id="1063714491" name="Imagen 1"/>
+            <wp:cNvGraphicFramePr>
+              <a:graphicFrameLocks xmlns:a="http://schemas.openxmlformats.org/drawingml/2006/main" noChangeAspect="1"/>
+            </wp:cNvGraphicFramePr>
+            <a:graphic xmlns:a="http://schemas.openxmlformats.org/drawingml/2006/main">
+              <a:graphicData uri="http://schemas.openxmlformats.org/drawingml/2006/picture">
+                <pic:pic xmlns:pic="http://schemas.openxmlformats.org/drawingml/2006/picture">
+                  <pic:nvPicPr>
+                    <pic:cNvPr id="1063714491" name=""/>
+                    <pic:cNvPicPr/>
+                  </pic:nvPicPr>
+                  <pic:blipFill>
+                    <a:blip r:embed="rId30"/>
+                    <a:stretch>
+                      <a:fillRect/>
+                    </a:stretch>
+                  </pic:blipFill>
+                  <pic:spPr>
+                    <a:xfrm>
+                      <a:off x="0" y="0"/>
+                      <a:ext cx="5540220" cy="762066"/>
+                    </a:xfrm>
+                    <a:prstGeom prst="rect">
+                      <a:avLst/>
+                    </a:prstGeom>
+                  </pic:spPr>
+                </pic:pic>
+              </a:graphicData>
+            </a:graphic>
+          </wp:inline>
+        </w:drawing>
+      </w:r>
+    </w:p>
+    <w:p>
+      <w:pPr>
+        <w:spacing w:after="0" w:line="240" w:lineRule="auto"/>
+        <w:rPr>
+          <w:rFonts w:ascii="Arial" w:eastAsia="Arial" w:hAnsi="Arial" w:cs="Arial"/>
+          <w:sz w:val="28"/>
+          <w:szCs w:val="28"/>
+        </w:rPr>
+      </w:pPr>
+      <w:r>
+        <w:rPr>
+          <w:rFonts w:ascii="Arial" w:eastAsia="Arial" w:hAnsi="Arial" w:cs="Arial"/>
+          <w:sz w:val="28"/>
+          <w:szCs w:val="28"/>
+        </w:rPr>
+        <w:drawing>
+          <wp:inline distT="0" distB="0" distL="0" distR="0" wp14:anchorId="7F3A2D88" wp14:editId="75F1B895">
+            <wp:extent cx="4839119" cy="838273"/>
+            <wp:effectExtent l="0" t="0" r="0" b="0"/>
+            <wp:docPr id="381134021" name="Imagen 1"/>
+            <wp:cNvGraphicFramePr>
+              <a:graphicFrameLocks xmlns:a="http://schemas.openxmlformats.org/drawingml/2006/main" noChangeAspect="1"/>
+            </wp:cNvGraphicFramePr>
+            <a:graphic xmlns:a="http://schemas.openxmlformats.org/drawingml/2006/main">
+              <a:graphicData uri="http://schemas.openxmlformats.org/drawingml/2006/picture">
+                <pic:pic xmlns:pic="http://schemas.openxmlformats.org/drawingml/2006/picture">
+                  <pic:nvPicPr>
+                    <pic:cNvPr id="381134021" name=""/>
+                    <pic:cNvPicPr/>
+                  </pic:nvPicPr>
+                  <pic:blipFill>
+                    <a:blip r:embed="rId31"/>
+                    <a:stretch>
+                      <a:fillRect/>
+                    </a:stretch>
+                  </pic:blipFill>
+                  <pic:spPr>
+                    <a:xfrm>
+                      <a:off x="0" y="0"/>
+                      <a:ext cx="4839119" cy="838273"/>
+                    </a:xfrm>
+                    <a:prstGeom prst="rect">
+                      <a:avLst/>
+                    </a:prstGeom>
+                  </pic:spPr>
+                </pic:pic>
+              </a:graphicData>
+            </a:graphic>
+          </wp:inline>
+        </w:drawing>
+      </w:r>
+    </w:p>
+    <w:p>
+      <w:pPr>
+        <w:pStyle w:val="Ttulo1"/>
+      </w:pPr>
+      <w:r>
+        <w:t>repositorio GitHub</w:t>
+      </w:r>
+    </w:p>
+    <w:p>
+      <w:hyperlink r:id="rId32" w:history="1">
+        <w:r>
+          <w:rPr>
+            <w:rStyle w:val="Hipervnculo"/>
+          </w:rPr>
+          <w:t xml:space="preserve">Cuarto-Trimestre-Instructora-Alexandra/Cuarto Trimestre/Actividad #6 at </w:t>
+        </w:r>
+        <w:proofErr w:type="spellStart"/>
+        <w:r>
+          <w:rPr>
+            <w:rStyle w:val="Hipervnculo"/>
+          </w:rPr>
+          <w:t>main</w:t>
+        </w:r>
+        <w:proofErr w:type="spellEnd"/>
+        <w:r>
+          <w:rPr>
+            <w:rStyle w:val="Hipervnculo"/>
+          </w:rPr>
+          <w:t xml:space="preserve"> · erikalegria1999-cmd/Cuarto-Trimestre-Instructora-Alexandra</w:t>
+        </w:r>
+      </w:hyperlink>
     </w:p>
     <w:sectPr>
-      <w:headerReference w:type="default" r:id="rId21"/>
+      <w:headerReference w:type="default" r:id="rId33"/>
       <w:pgSz w:w="12240" w:h="15840"/>
       <w:pgMar w:top="1417" w:right="1701" w:bottom="1417" w:left="1701" w:header="708" w:footer="708" w:gutter="0"/>
       <w:pgNumType w:start="1"/>
@@ -15615,6 +15798,18 @@
       <w:bCs/>
     </w:rPr>
   </w:style>
+  <w:style w:type="character" w:styleId="Mencinsinresolver">
+    <w:name w:val="Unresolved Mention"/>
+    <w:basedOn w:val="Fuentedeprrafopredeter"/>
+    <w:uiPriority w:val="99"/>
+    <w:semiHidden/>
+    <w:unhideWhenUsed/>
+    <w:rsid w:val="00964E3A"/>
+    <w:rPr>
+      <w:color w:val="605E5C"/>
+      <w:shd w:val="clear" w:color="auto" w:fill="E1DFDD"/>
+    </w:rPr>
+  </w:style>
 </w:styles>
 </file>
 

</xml_diff>